<commit_message>
Incorpora itens da lista de transferência ao modelo de solicitação
Prioriza Societário e DP, inclui desvinculação no S@T (SEF/SC) e na
prefeitura, e-CPF dos sócios, CNO, DIRPF dos sócios, notas e CT-e
pendentes, balancete sem zeramento, ECD do exercício e fichas de ativos.
Atualiza DIRF e RAIS como obrigações já substituídas.

Co-Authored-By: Claude Opus 5.5 <noreply@anthropic.com>
Claude-Session: https://claude.ai/code/session_01XopHE9RnDDa28n6ZEpDAfk
</commit_message>
<xml_diff>
--- a/modelos/Solicitacao_Documentos_Transferencia.docx
+++ b/modelos/Solicitacao_Documentos_Transferencia.docx
@@ -118,6 +118,45 @@
     </w:p>
     <w:p>
       <w:pPr>
+        <w:spacing w:after="120" w:line="276"/>
+        <w:jc w:val="both"/>
+      </w:pPr>
+      <w:r>
+        <w:t xml:space="preserve">Com o devido respeito, pedimos que a documentação do </w:t>
+      </w:r>
+      <w:r>
+        <w:rPr>
+          <w:b/>
+          <w:bCs/>
+        </w:rPr>
+        <w:t xml:space="preserve">Societário</w:t>
+      </w:r>
+      <w:r>
+        <w:t xml:space="preserve"> e do </w:t>
+      </w:r>
+      <w:r>
+        <w:rPr>
+          <w:b/>
+          <w:bCs/>
+        </w:rPr>
+        <w:t xml:space="preserve">Departamento Pessoal</w:t>
+      </w:r>
+      <w:r>
+        <w:t xml:space="preserve"> seja encaminhada o quanto antes, pois é necessária para darmos continuidade à folha e às rotinas cadastrais. Solicitamos também a </w:t>
+      </w:r>
+      <w:r>
+        <w:rPr>
+          <w:b/>
+          <w:bCs/>
+        </w:rPr>
+        <w:t xml:space="preserve">desvinculação no S@T (SEF/SC) e na Prefeitura de [MUNICÍPIO]/SC</w:t>
+      </w:r>
+      <w:r>
+        <w:t xml:space="preserve"> assim que concluídas as apurações da competência de corte.</w:t>
+      </w:r>
+    </w:p>
+    <w:p>
+      <w:pPr>
         <w:pStyle w:val="Heading2"/>
         <w:spacing w:after="120" w:before="240"/>
       </w:pPr>
@@ -561,7 +600,72 @@
                 <w:sz w:val="19"/>
                 <w:szCs w:val="19"/>
               </w:rPr>
-              <w:t xml:space="preserve">Prazo para entrega</w:t>
+              <w:t xml:space="preserve">Prazo para Societário e Departamento Pessoal (prioritários)</w:t>
+            </w:r>
+          </w:p>
+        </w:tc>
+        <w:tc>
+          <w:tcPr>
+            <w:tcW w:type="dxa" w:w="5438"/>
+            <w:tcBorders>
+              <w:top w:val="single" w:color="A6A6A6" w:sz="4"/>
+              <w:left w:val="single" w:color="A6A6A6" w:sz="4"/>
+              <w:bottom w:val="single" w:color="A6A6A6" w:sz="4"/>
+              <w:right w:val="single" w:color="A6A6A6" w:sz="4"/>
+            </w:tcBorders>
+            <w:tcMar>
+              <w:top w:type="dxa" w:w="60"/>
+              <w:left w:type="dxa" w:w="100"/>
+              <w:bottom w:type="dxa" w:w="60"/>
+              <w:right w:type="dxa" w:w="100"/>
+            </w:tcMar>
+            <w:vAlign w:val="center"/>
+          </w:tcPr>
+          <w:p>
+            <w:pPr>
+              <w:jc w:val="left"/>
+            </w:pPr>
+            <w:r>
+              <w:rPr>
+                <w:sz w:val="19"/>
+                <w:szCs w:val="19"/>
+              </w:rPr>
+              <w:t xml:space="preserve">[DD/MM/AAAA] (o quanto antes — sugestão: 5 dias)</w:t>
+            </w:r>
+          </w:p>
+        </w:tc>
+      </w:tr>
+      <w:tr>
+        <w:tc>
+          <w:tcPr>
+            <w:tcW w:type="dxa" w:w="4200"/>
+            <w:tcBorders>
+              <w:top w:val="single" w:color="A6A6A6" w:sz="4"/>
+              <w:left w:val="single" w:color="A6A6A6" w:sz="4"/>
+              <w:bottom w:val="single" w:color="A6A6A6" w:sz="4"/>
+              <w:right w:val="single" w:color="A6A6A6" w:sz="4"/>
+            </w:tcBorders>
+            <w:shd w:fill="D9E2F3" w:color="auto" w:val="clear"/>
+            <w:tcMar>
+              <w:top w:type="dxa" w:w="60"/>
+              <w:left w:type="dxa" w:w="100"/>
+              <w:bottom w:type="dxa" w:w="60"/>
+              <w:right w:type="dxa" w:w="100"/>
+            </w:tcMar>
+            <w:vAlign w:val="center"/>
+          </w:tcPr>
+          <w:p>
+            <w:pPr>
+              <w:jc w:val="left"/>
+            </w:pPr>
+            <w:r>
+              <w:rPr>
+                <w:b/>
+                <w:bCs/>
+                <w:sz w:val="19"/>
+                <w:szCs w:val="19"/>
+              </w:rPr>
+              <w:t xml:space="preserve">Prazo para os demais documentos</w:t>
             </w:r>
           </w:p>
         </w:tc>
@@ -799,7 +903,7 @@
         <w:spacing w:after="60"/>
       </w:pPr>
       <w:r>
-        <w:t xml:space="preserve">Após a entrega das obrigações da competência de corte, solicitamos a revogação das procurações eletrônicas em nome de V.Sas.</w:t>
+        <w:t xml:space="preserve">Após a entrega das obrigações da competência de corte, solicitamos a revogação das procurações eletrônicas e a desvinculação nos sistemas (S@T, prefeitura, e-CAC, eSocial) em nome de V.Sas.</w:t>
       </w:r>
     </w:p>
     <w:p>
@@ -891,7 +995,7 @@
         <w:spacing w:after="120" w:before="280"/>
       </w:pPr>
       <w:r>
-        <w:t xml:space="preserve">1. Cadastro e Societário</w:t>
+        <w:t xml:space="preserve">1. Cadastro e Societário — PRIORITÁRIO</w:t>
       </w:r>
     </w:p>
     <w:tbl>
@@ -1113,7 +1217,7 @@
                 <w:sz w:val="19"/>
                 <w:szCs w:val="19"/>
               </w:rPr>
-              <w:t xml:space="preserve">Contrato social consolidado e todas as alterações registradas (Junta Comercial / Cartório)</w:t>
+              <w:t xml:space="preserve">Contrato social de constituição e todas as alterações contratuais registradas (Junta Comercial / Cartório)</w:t>
             </w:r>
           </w:p>
         </w:tc>
@@ -1494,7 +1598,7 @@
                 <w:sz w:val="19"/>
                 <w:szCs w:val="19"/>
               </w:rPr>
-              <w:t xml:space="preserve">Certificado digital (arquivo A1 + senha) ou informação de tipo, titular e validade</w:t>
+              <w:t xml:space="preserve">Certificado digital e-CNPJ: arquivo A1 + senha de instalação (ou tipo, titular e validade, se A3)</w:t>
             </w:r>
           </w:p>
         </w:tc>
@@ -1621,7 +1725,7 @@
                 <w:sz w:val="19"/>
                 <w:szCs w:val="19"/>
               </w:rPr>
-              <w:t xml:space="preserve">Documentos dos sócios/administradores: RG ou CNH, CPF, comprovante de endereço, estado civil</w:t>
+              <w:t xml:space="preserve">Certificado digital e-CPF dos sócios: arquivo A1 + senha de instalação (se houver)</w:t>
             </w:r>
           </w:p>
         </w:tc>
@@ -1651,7 +1755,7 @@
                 <w:sz w:val="19"/>
                 <w:szCs w:val="19"/>
               </w:rPr>
-              <w:t xml:space="preserve">Atual</w:t>
+              <w:t xml:space="preserve">Vigente</w:t>
             </w:r>
           </w:p>
         </w:tc>
@@ -1748,7 +1852,7 @@
                 <w:sz w:val="19"/>
                 <w:szCs w:val="19"/>
               </w:rPr>
-              <w:t xml:space="preserve">Quadro societário: percentual de participação, administrador(es) e valor do pró-labore de cada sócio</w:t>
+              <w:t xml:space="preserve">Documentos dos sócios/administradores: RG ou CNH, CPF, comprovante de endereço, estado civil</w:t>
             </w:r>
           </w:p>
         </w:tc>
@@ -1779,7 +1883,7 @@
                 <w:sz w:val="19"/>
                 <w:szCs w:val="19"/>
               </w:rPr>
-              <w:t xml:space="preserve">Atual + Período de histórico</w:t>
+              <w:t xml:space="preserve">Atual</w:t>
             </w:r>
           </w:p>
         </w:tc>
@@ -1875,7 +1979,7 @@
                 <w:sz w:val="19"/>
                 <w:szCs w:val="19"/>
               </w:rPr>
-              <w:t xml:space="preserve">Relação de procurações eletrônicas vigentes (e-CAC, eSocial, Simples Nacional, SEFAZ, prefeitura)</w:t>
+              <w:t xml:space="preserve">Documentações das obras e CNO (Cadastro Nacional de Obras), se houver</w:t>
             </w:r>
           </w:p>
         </w:tc>
@@ -1905,6 +2009,260 @@
                 <w:sz w:val="19"/>
                 <w:szCs w:val="19"/>
               </w:rPr>
+              <w:t xml:space="preserve">Obras ativas</w:t>
+            </w:r>
+          </w:p>
+        </w:tc>
+        <w:tc>
+          <w:tcPr>
+            <w:tcW w:type="dxa" w:w="2168"/>
+            <w:tcBorders>
+              <w:top w:val="single" w:color="A6A6A6" w:sz="4"/>
+              <w:left w:val="single" w:color="A6A6A6" w:sz="4"/>
+              <w:bottom w:val="single" w:color="A6A6A6" w:sz="4"/>
+              <w:right w:val="single" w:color="A6A6A6" w:sz="4"/>
+            </w:tcBorders>
+            <w:tcMar>
+              <w:top w:type="dxa" w:w="60"/>
+              <w:left w:type="dxa" w:w="100"/>
+              <w:bottom w:type="dxa" w:w="60"/>
+              <w:right w:type="dxa" w:w="100"/>
+            </w:tcMar>
+            <w:vAlign w:val="center"/>
+          </w:tcPr>
+          <w:p>
+            <w:pPr>
+              <w:jc w:val="left"/>
+            </w:pPr>
+            <w:r>
+              <w:rPr>
+                <w:sz w:val="19"/>
+                <w:szCs w:val="19"/>
+              </w:rPr>
+              <w:t xml:space="preserve"/>
+            </w:r>
+          </w:p>
+        </w:tc>
+      </w:tr>
+      <w:tr>
+        <w:trPr>
+          <w:cantSplit/>
+        </w:trPr>
+        <w:tc>
+          <w:tcPr>
+            <w:tcW w:type="dxa" w:w="520"/>
+            <w:tcBorders>
+              <w:top w:val="single" w:color="A6A6A6" w:sz="4"/>
+              <w:left w:val="single" w:color="A6A6A6" w:sz="4"/>
+              <w:bottom w:val="single" w:color="A6A6A6" w:sz="4"/>
+              <w:right w:val="single" w:color="A6A6A6" w:sz="4"/>
+            </w:tcBorders>
+            <w:shd w:fill="F2F2F2" w:color="auto" w:val="clear"/>
+            <w:tcMar>
+              <w:top w:type="dxa" w:w="60"/>
+              <w:left w:type="dxa" w:w="100"/>
+              <w:bottom w:type="dxa" w:w="60"/>
+              <w:right w:type="dxa" w:w="100"/>
+            </w:tcMar>
+            <w:vAlign w:val="center"/>
+          </w:tcPr>
+          <w:p>
+            <w:pPr>
+              <w:jc w:val="center"/>
+            </w:pPr>
+            <w:r>
+              <w:rPr>
+                <w:sz w:val="22"/>
+                <w:szCs w:val="22"/>
+              </w:rPr>
+              <w:t xml:space="preserve">☐</w:t>
+            </w:r>
+          </w:p>
+        </w:tc>
+        <w:tc>
+          <w:tcPr>
+            <w:tcW w:type="dxa" w:w="4700"/>
+            <w:tcBorders>
+              <w:top w:val="single" w:color="A6A6A6" w:sz="4"/>
+              <w:left w:val="single" w:color="A6A6A6" w:sz="4"/>
+              <w:bottom w:val="single" w:color="A6A6A6" w:sz="4"/>
+              <w:right w:val="single" w:color="A6A6A6" w:sz="4"/>
+            </w:tcBorders>
+            <w:shd w:fill="F2F2F2" w:color="auto" w:val="clear"/>
+            <w:tcMar>
+              <w:top w:type="dxa" w:w="60"/>
+              <w:left w:type="dxa" w:w="100"/>
+              <w:bottom w:type="dxa" w:w="60"/>
+              <w:right w:type="dxa" w:w="100"/>
+            </w:tcMar>
+            <w:vAlign w:val="center"/>
+          </w:tcPr>
+          <w:p>
+            <w:pPr>
+              <w:jc w:val="left"/>
+            </w:pPr>
+            <w:r>
+              <w:rPr>
+                <w:sz w:val="19"/>
+                <w:szCs w:val="19"/>
+              </w:rPr>
+              <w:t xml:space="preserve">Quadro societário: percentual de participação, administrador(es) e valor do pró-labore de cada sócio</w:t>
+            </w:r>
+          </w:p>
+        </w:tc>
+        <w:tc>
+          <w:tcPr>
+            <w:tcW w:type="dxa" w:w="2250"/>
+            <w:tcBorders>
+              <w:top w:val="single" w:color="A6A6A6" w:sz="4"/>
+              <w:left w:val="single" w:color="A6A6A6" w:sz="4"/>
+              <w:bottom w:val="single" w:color="A6A6A6" w:sz="4"/>
+              <w:right w:val="single" w:color="A6A6A6" w:sz="4"/>
+            </w:tcBorders>
+            <w:shd w:fill="F2F2F2" w:color="auto" w:val="clear"/>
+            <w:tcMar>
+              <w:top w:type="dxa" w:w="60"/>
+              <w:left w:type="dxa" w:w="100"/>
+              <w:bottom w:type="dxa" w:w="60"/>
+              <w:right w:type="dxa" w:w="100"/>
+            </w:tcMar>
+            <w:vAlign w:val="center"/>
+          </w:tcPr>
+          <w:p>
+            <w:pPr>
+              <w:jc w:val="left"/>
+            </w:pPr>
+            <w:r>
+              <w:rPr>
+                <w:sz w:val="19"/>
+                <w:szCs w:val="19"/>
+              </w:rPr>
+              <w:t xml:space="preserve">Atual + Período de histórico</w:t>
+            </w:r>
+          </w:p>
+        </w:tc>
+        <w:tc>
+          <w:tcPr>
+            <w:tcW w:type="dxa" w:w="2168"/>
+            <w:tcBorders>
+              <w:top w:val="single" w:color="A6A6A6" w:sz="4"/>
+              <w:left w:val="single" w:color="A6A6A6" w:sz="4"/>
+              <w:bottom w:val="single" w:color="A6A6A6" w:sz="4"/>
+              <w:right w:val="single" w:color="A6A6A6" w:sz="4"/>
+            </w:tcBorders>
+            <w:shd w:fill="F2F2F2" w:color="auto" w:val="clear"/>
+            <w:tcMar>
+              <w:top w:type="dxa" w:w="60"/>
+              <w:left w:type="dxa" w:w="100"/>
+              <w:bottom w:type="dxa" w:w="60"/>
+              <w:right w:type="dxa" w:w="100"/>
+            </w:tcMar>
+            <w:vAlign w:val="center"/>
+          </w:tcPr>
+          <w:p>
+            <w:pPr>
+              <w:jc w:val="left"/>
+            </w:pPr>
+            <w:r>
+              <w:rPr>
+                <w:sz w:val="19"/>
+                <w:szCs w:val="19"/>
+              </w:rPr>
+              <w:t xml:space="preserve"/>
+            </w:r>
+          </w:p>
+        </w:tc>
+      </w:tr>
+      <w:tr>
+        <w:trPr>
+          <w:cantSplit/>
+        </w:trPr>
+        <w:tc>
+          <w:tcPr>
+            <w:tcW w:type="dxa" w:w="520"/>
+            <w:tcBorders>
+              <w:top w:val="single" w:color="A6A6A6" w:sz="4"/>
+              <w:left w:val="single" w:color="A6A6A6" w:sz="4"/>
+              <w:bottom w:val="single" w:color="A6A6A6" w:sz="4"/>
+              <w:right w:val="single" w:color="A6A6A6" w:sz="4"/>
+            </w:tcBorders>
+            <w:tcMar>
+              <w:top w:type="dxa" w:w="60"/>
+              <w:left w:type="dxa" w:w="100"/>
+              <w:bottom w:type="dxa" w:w="60"/>
+              <w:right w:type="dxa" w:w="100"/>
+            </w:tcMar>
+            <w:vAlign w:val="center"/>
+          </w:tcPr>
+          <w:p>
+            <w:pPr>
+              <w:jc w:val="center"/>
+            </w:pPr>
+            <w:r>
+              <w:rPr>
+                <w:sz w:val="22"/>
+                <w:szCs w:val="22"/>
+              </w:rPr>
+              <w:t xml:space="preserve">☐</w:t>
+            </w:r>
+          </w:p>
+        </w:tc>
+        <w:tc>
+          <w:tcPr>
+            <w:tcW w:type="dxa" w:w="4700"/>
+            <w:tcBorders>
+              <w:top w:val="single" w:color="A6A6A6" w:sz="4"/>
+              <w:left w:val="single" w:color="A6A6A6" w:sz="4"/>
+              <w:bottom w:val="single" w:color="A6A6A6" w:sz="4"/>
+              <w:right w:val="single" w:color="A6A6A6" w:sz="4"/>
+            </w:tcBorders>
+            <w:tcMar>
+              <w:top w:type="dxa" w:w="60"/>
+              <w:left w:type="dxa" w:w="100"/>
+              <w:bottom w:type="dxa" w:w="60"/>
+              <w:right w:type="dxa" w:w="100"/>
+            </w:tcMar>
+            <w:vAlign w:val="center"/>
+          </w:tcPr>
+          <w:p>
+            <w:pPr>
+              <w:jc w:val="left"/>
+            </w:pPr>
+            <w:r>
+              <w:rPr>
+                <w:sz w:val="19"/>
+                <w:szCs w:val="19"/>
+              </w:rPr>
+              <w:t xml:space="preserve">Códigos de acesso e senhas: e-CAC e Simples Nacional</w:t>
+            </w:r>
+          </w:p>
+        </w:tc>
+        <w:tc>
+          <w:tcPr>
+            <w:tcW w:type="dxa" w:w="2250"/>
+            <w:tcBorders>
+              <w:top w:val="single" w:color="A6A6A6" w:sz="4"/>
+              <w:left w:val="single" w:color="A6A6A6" w:sz="4"/>
+              <w:bottom w:val="single" w:color="A6A6A6" w:sz="4"/>
+              <w:right w:val="single" w:color="A6A6A6" w:sz="4"/>
+            </w:tcBorders>
+            <w:tcMar>
+              <w:top w:type="dxa" w:w="60"/>
+              <w:left w:type="dxa" w:w="100"/>
+              <w:bottom w:type="dxa" w:w="60"/>
+              <w:right w:type="dxa" w:w="100"/>
+            </w:tcMar>
+            <w:vAlign w:val="center"/>
+          </w:tcPr>
+          <w:p>
+            <w:pPr>
+              <w:jc w:val="left"/>
+            </w:pPr>
+            <w:r>
+              <w:rPr>
+                <w:sz w:val="19"/>
+                <w:szCs w:val="19"/>
+              </w:rPr>
               <w:t xml:space="preserve">Atual</w:t>
             </w:r>
           </w:p>
@@ -1918,6 +2276,135 @@
               <w:bottom w:val="single" w:color="A6A6A6" w:sz="4"/>
               <w:right w:val="single" w:color="A6A6A6" w:sz="4"/>
             </w:tcBorders>
+            <w:tcMar>
+              <w:top w:type="dxa" w:w="60"/>
+              <w:left w:type="dxa" w:w="100"/>
+              <w:bottom w:type="dxa" w:w="60"/>
+              <w:right w:type="dxa" w:w="100"/>
+            </w:tcMar>
+            <w:vAlign w:val="center"/>
+          </w:tcPr>
+          <w:p>
+            <w:pPr>
+              <w:jc w:val="left"/>
+            </w:pPr>
+            <w:r>
+              <w:rPr>
+                <w:sz w:val="19"/>
+                <w:szCs w:val="19"/>
+              </w:rPr>
+              <w:t xml:space="preserve"/>
+            </w:r>
+          </w:p>
+        </w:tc>
+      </w:tr>
+      <w:tr>
+        <w:trPr>
+          <w:cantSplit/>
+        </w:trPr>
+        <w:tc>
+          <w:tcPr>
+            <w:tcW w:type="dxa" w:w="520"/>
+            <w:tcBorders>
+              <w:top w:val="single" w:color="A6A6A6" w:sz="4"/>
+              <w:left w:val="single" w:color="A6A6A6" w:sz="4"/>
+              <w:bottom w:val="single" w:color="A6A6A6" w:sz="4"/>
+              <w:right w:val="single" w:color="A6A6A6" w:sz="4"/>
+            </w:tcBorders>
+            <w:shd w:fill="F2F2F2" w:color="auto" w:val="clear"/>
+            <w:tcMar>
+              <w:top w:type="dxa" w:w="60"/>
+              <w:left w:type="dxa" w:w="100"/>
+              <w:bottom w:type="dxa" w:w="60"/>
+              <w:right w:type="dxa" w:w="100"/>
+            </w:tcMar>
+            <w:vAlign w:val="center"/>
+          </w:tcPr>
+          <w:p>
+            <w:pPr>
+              <w:jc w:val="center"/>
+            </w:pPr>
+            <w:r>
+              <w:rPr>
+                <w:sz w:val="22"/>
+                <w:szCs w:val="22"/>
+              </w:rPr>
+              <w:t xml:space="preserve">☐</w:t>
+            </w:r>
+          </w:p>
+        </w:tc>
+        <w:tc>
+          <w:tcPr>
+            <w:tcW w:type="dxa" w:w="4700"/>
+            <w:tcBorders>
+              <w:top w:val="single" w:color="A6A6A6" w:sz="4"/>
+              <w:left w:val="single" w:color="A6A6A6" w:sz="4"/>
+              <w:bottom w:val="single" w:color="A6A6A6" w:sz="4"/>
+              <w:right w:val="single" w:color="A6A6A6" w:sz="4"/>
+            </w:tcBorders>
+            <w:shd w:fill="F2F2F2" w:color="auto" w:val="clear"/>
+            <w:tcMar>
+              <w:top w:type="dxa" w:w="60"/>
+              <w:left w:type="dxa" w:w="100"/>
+              <w:bottom w:type="dxa" w:w="60"/>
+              <w:right w:type="dxa" w:w="100"/>
+            </w:tcMar>
+            <w:vAlign w:val="center"/>
+          </w:tcPr>
+          <w:p>
+            <w:pPr>
+              <w:jc w:val="left"/>
+            </w:pPr>
+            <w:r>
+              <w:rPr>
+                <w:sz w:val="19"/>
+                <w:szCs w:val="19"/>
+              </w:rPr>
+              <w:t xml:space="preserve">Relação de procurações eletrônicas vigentes (e-CAC, eSocial, Simples Nacional, SEF/SC, prefeitura)</w:t>
+            </w:r>
+          </w:p>
+        </w:tc>
+        <w:tc>
+          <w:tcPr>
+            <w:tcW w:type="dxa" w:w="2250"/>
+            <w:tcBorders>
+              <w:top w:val="single" w:color="A6A6A6" w:sz="4"/>
+              <w:left w:val="single" w:color="A6A6A6" w:sz="4"/>
+              <w:bottom w:val="single" w:color="A6A6A6" w:sz="4"/>
+              <w:right w:val="single" w:color="A6A6A6" w:sz="4"/>
+            </w:tcBorders>
+            <w:shd w:fill="F2F2F2" w:color="auto" w:val="clear"/>
+            <w:tcMar>
+              <w:top w:type="dxa" w:w="60"/>
+              <w:left w:type="dxa" w:w="100"/>
+              <w:bottom w:type="dxa" w:w="60"/>
+              <w:right w:type="dxa" w:w="100"/>
+            </w:tcMar>
+            <w:vAlign w:val="center"/>
+          </w:tcPr>
+          <w:p>
+            <w:pPr>
+              <w:jc w:val="left"/>
+            </w:pPr>
+            <w:r>
+              <w:rPr>
+                <w:sz w:val="19"/>
+                <w:szCs w:val="19"/>
+              </w:rPr>
+              <w:t xml:space="preserve">Atual</w:t>
+            </w:r>
+          </w:p>
+        </w:tc>
+        <w:tc>
+          <w:tcPr>
+            <w:tcW w:type="dxa" w:w="2168"/>
+            <w:tcBorders>
+              <w:top w:val="single" w:color="A6A6A6" w:sz="4"/>
+              <w:left w:val="single" w:color="A6A6A6" w:sz="4"/>
+              <w:bottom w:val="single" w:color="A6A6A6" w:sz="4"/>
+              <w:right w:val="single" w:color="A6A6A6" w:sz="4"/>
+            </w:tcBorders>
+            <w:shd w:fill="F2F2F2" w:color="auto" w:val="clear"/>
             <w:tcMar>
               <w:top w:type="dxa" w:w="60"/>
               <w:left w:type="dxa" w:w="100"/>
@@ -2805,7 +3292,7 @@
                 <w:sz w:val="19"/>
                 <w:szCs w:val="19"/>
               </w:rPr>
-              <w:t xml:space="preserve">Recibos das declarações entregues: PGDAS-D, DEFIS, DCTFWeb, EFD-Reinf, EFD-Contribuições, EFD-ICMS/IPI, GIA/DeSTDA, ECD, ECF</w:t>
+              <w:t xml:space="preserve">Relação de TODAS as notas fiscais de entrada e conhecimentos de transporte (CT-e) pendentes de lançamento</w:t>
             </w:r>
           </w:p>
         </w:tc>
@@ -2836,7 +3323,7 @@
                 <w:sz w:val="19"/>
                 <w:szCs w:val="19"/>
               </w:rPr>
-              <w:t xml:space="preserve">Últimos 5 anos</w:t>
+              <w:t xml:space="preserve">Até a competência de corte</w:t>
             </w:r>
           </w:p>
         </w:tc>
@@ -2932,7 +3419,7 @@
                 <w:sz w:val="19"/>
                 <w:szCs w:val="19"/>
               </w:rPr>
-              <w:t xml:space="preserve">Relatório de Situação Fiscal (e-CAC/PGFN) e certidões negativas: federal, estadual, municipal, FGTS e trabalhista</w:t>
+              <w:t xml:space="preserve">Recibos das declarações entregues: PGDAS-D, DEFIS, DCTFWeb, EFD-Reinf, EFD-Contribuições, EFD-ICMS/IPI, GIA/DeSTDA, ECD, ECF</w:t>
             </w:r>
           </w:p>
         </w:tc>
@@ -2962,7 +3449,7 @@
                 <w:sz w:val="19"/>
                 <w:szCs w:val="19"/>
               </w:rPr>
-              <w:t xml:space="preserve">Atual</w:t>
+              <w:t xml:space="preserve">Últimos 5 anos</w:t>
             </w:r>
           </w:p>
         </w:tc>
@@ -3059,7 +3546,7 @@
                 <w:sz w:val="19"/>
                 <w:szCs w:val="19"/>
               </w:rPr>
-              <w:t xml:space="preserve">Parcelamentos ativos (modalidade, nº, saldo, parcelas pagas) e débitos em aberto conhecidos</w:t>
+              <w:t xml:space="preserve">Relatório de Situação Fiscal (e-CAC/PGFN) e certidões negativas: federal, estadual, municipal, FGTS e trabalhista</w:t>
             </w:r>
           </w:p>
         </w:tc>
@@ -3186,7 +3673,7 @@
                 <w:sz w:val="19"/>
                 <w:szCs w:val="19"/>
               </w:rPr>
-              <w:t xml:space="preserve">Saldos credores e créditos a compensar (ICMS, PIS/COFINS, retenções sofridas, PER/DCOMP em andamento)</w:t>
+              <w:t xml:space="preserve">Parcelamentos ativos (modalidade, nº, saldo, parcelas pagas) e débitos em aberto conhecidos</w:t>
             </w:r>
           </w:p>
         </w:tc>
@@ -3216,7 +3703,7 @@
                 <w:sz w:val="19"/>
                 <w:szCs w:val="19"/>
               </w:rPr>
-              <w:t xml:space="preserve">Data/competência de corte</w:t>
+              <w:t xml:space="preserve">Atual</w:t>
             </w:r>
           </w:p>
         </w:tc>
@@ -3313,7 +3800,7 @@
                 <w:sz w:val="19"/>
                 <w:szCs w:val="19"/>
               </w:rPr>
-              <w:t xml:space="preserve">Retenções na fonte (sofridas e efetuadas), benefícios fiscais, regimes especiais e ICMS-ST</w:t>
+              <w:t xml:space="preserve">Saldos credores de ICMS e IPI de períodos anteriores e demais créditos a compensar (PIS/COFINS, retenções sofridas, PER/DCOMP em andamento)</w:t>
             </w:r>
           </w:p>
         </w:tc>
@@ -3344,7 +3831,7 @@
                 <w:sz w:val="19"/>
                 <w:szCs w:val="19"/>
               </w:rPr>
-              <w:t xml:space="preserve">Vigentes</w:t>
+              <w:t xml:space="preserve">Data/competência de corte</w:t>
             </w:r>
           </w:p>
         </w:tc>
@@ -3440,7 +3927,7 @@
                 <w:sz w:val="19"/>
                 <w:szCs w:val="19"/>
               </w:rPr>
-              <w:t xml:space="preserve">Acessos: código de acesso do Simples Nacional, login/senha da prefeitura (NFS-e) e do portal da SEFAZ</w:t>
+              <w:t xml:space="preserve">Retenções na fonte (sofridas e efetuadas), benefícios fiscais, regimes especiais e ICMS-ST</w:t>
             </w:r>
           </w:p>
         </w:tc>
@@ -3470,7 +3957,7 @@
                 <w:sz w:val="19"/>
                 <w:szCs w:val="19"/>
               </w:rPr>
-              <w:t xml:space="preserve">Atual</w:t>
+              <w:t xml:space="preserve">Vigentes</w:t>
             </w:r>
           </w:p>
         </w:tc>
@@ -3567,6 +4054,641 @@
                 <w:sz w:val="19"/>
                 <w:szCs w:val="19"/>
               </w:rPr>
+              <w:t xml:space="preserve">Acessos: login/senha do sistema de NFS-e da prefeitura e senha Web/FAP</w:t>
+            </w:r>
+          </w:p>
+        </w:tc>
+        <w:tc>
+          <w:tcPr>
+            <w:tcW w:type="dxa" w:w="2250"/>
+            <w:tcBorders>
+              <w:top w:val="single" w:color="A6A6A6" w:sz="4"/>
+              <w:left w:val="single" w:color="A6A6A6" w:sz="4"/>
+              <w:bottom w:val="single" w:color="A6A6A6" w:sz="4"/>
+              <w:right w:val="single" w:color="A6A6A6" w:sz="4"/>
+            </w:tcBorders>
+            <w:shd w:fill="F2F2F2" w:color="auto" w:val="clear"/>
+            <w:tcMar>
+              <w:top w:type="dxa" w:w="60"/>
+              <w:left w:type="dxa" w:w="100"/>
+              <w:bottom w:type="dxa" w:w="60"/>
+              <w:right w:type="dxa" w:w="100"/>
+            </w:tcMar>
+            <w:vAlign w:val="center"/>
+          </w:tcPr>
+          <w:p>
+            <w:pPr>
+              <w:jc w:val="left"/>
+            </w:pPr>
+            <w:r>
+              <w:rPr>
+                <w:sz w:val="19"/>
+                <w:szCs w:val="19"/>
+              </w:rPr>
+              <w:t xml:space="preserve">Atual</w:t>
+            </w:r>
+          </w:p>
+        </w:tc>
+        <w:tc>
+          <w:tcPr>
+            <w:tcW w:type="dxa" w:w="2168"/>
+            <w:tcBorders>
+              <w:top w:val="single" w:color="A6A6A6" w:sz="4"/>
+              <w:left w:val="single" w:color="A6A6A6" w:sz="4"/>
+              <w:bottom w:val="single" w:color="A6A6A6" w:sz="4"/>
+              <w:right w:val="single" w:color="A6A6A6" w:sz="4"/>
+            </w:tcBorders>
+            <w:shd w:fill="F2F2F2" w:color="auto" w:val="clear"/>
+            <w:tcMar>
+              <w:top w:type="dxa" w:w="60"/>
+              <w:left w:type="dxa" w:w="100"/>
+              <w:bottom w:type="dxa" w:w="60"/>
+              <w:right w:type="dxa" w:w="100"/>
+            </w:tcMar>
+            <w:vAlign w:val="center"/>
+          </w:tcPr>
+          <w:p>
+            <w:pPr>
+              <w:jc w:val="left"/>
+            </w:pPr>
+            <w:r>
+              <w:rPr>
+                <w:sz w:val="19"/>
+                <w:szCs w:val="19"/>
+              </w:rPr>
+              <w:t xml:space="preserve"/>
+            </w:r>
+          </w:p>
+        </w:tc>
+      </w:tr>
+      <w:tr>
+        <w:trPr>
+          <w:cantSplit/>
+        </w:trPr>
+        <w:tc>
+          <w:tcPr>
+            <w:tcW w:type="dxa" w:w="520"/>
+            <w:tcBorders>
+              <w:top w:val="single" w:color="A6A6A6" w:sz="4"/>
+              <w:left w:val="single" w:color="A6A6A6" w:sz="4"/>
+              <w:bottom w:val="single" w:color="A6A6A6" w:sz="4"/>
+              <w:right w:val="single" w:color="A6A6A6" w:sz="4"/>
+            </w:tcBorders>
+            <w:tcMar>
+              <w:top w:type="dxa" w:w="60"/>
+              <w:left w:type="dxa" w:w="100"/>
+              <w:bottom w:type="dxa" w:w="60"/>
+              <w:right w:type="dxa" w:w="100"/>
+            </w:tcMar>
+            <w:vAlign w:val="center"/>
+          </w:tcPr>
+          <w:p>
+            <w:pPr>
+              <w:jc w:val="center"/>
+            </w:pPr>
+            <w:r>
+              <w:rPr>
+                <w:sz w:val="22"/>
+                <w:szCs w:val="22"/>
+              </w:rPr>
+              <w:t xml:space="preserve">☐</w:t>
+            </w:r>
+          </w:p>
+        </w:tc>
+        <w:tc>
+          <w:tcPr>
+            <w:tcW w:type="dxa" w:w="4700"/>
+            <w:tcBorders>
+              <w:top w:val="single" w:color="A6A6A6" w:sz="4"/>
+              <w:left w:val="single" w:color="A6A6A6" w:sz="4"/>
+              <w:bottom w:val="single" w:color="A6A6A6" w:sz="4"/>
+              <w:right w:val="single" w:color="A6A6A6" w:sz="4"/>
+            </w:tcBorders>
+            <w:tcMar>
+              <w:top w:type="dxa" w:w="60"/>
+              <w:left w:type="dxa" w:w="100"/>
+              <w:bottom w:type="dxa" w:w="60"/>
+              <w:right w:type="dxa" w:w="100"/>
+            </w:tcMar>
+            <w:vAlign w:val="center"/>
+          </w:tcPr>
+          <w:p>
+            <w:pPr>
+              <w:jc w:val="left"/>
+            </w:pPr>
+            <w:r>
+              <w:rPr>
+                <w:sz w:val="19"/>
+                <w:szCs w:val="19"/>
+              </w:rPr>
+              <w:t xml:space="preserve">Desvinculação do escritório no S@T (SEF/SC), assim que finalizar as apurações da competência de corte</w:t>
+            </w:r>
+          </w:p>
+        </w:tc>
+        <w:tc>
+          <w:tcPr>
+            <w:tcW w:type="dxa" w:w="2250"/>
+            <w:tcBorders>
+              <w:top w:val="single" w:color="A6A6A6" w:sz="4"/>
+              <w:left w:val="single" w:color="A6A6A6" w:sz="4"/>
+              <w:bottom w:val="single" w:color="A6A6A6" w:sz="4"/>
+              <w:right w:val="single" w:color="A6A6A6" w:sz="4"/>
+            </w:tcBorders>
+            <w:tcMar>
+              <w:top w:type="dxa" w:w="60"/>
+              <w:left w:type="dxa" w:w="100"/>
+              <w:bottom w:type="dxa" w:w="60"/>
+              <w:right w:type="dxa" w:w="100"/>
+            </w:tcMar>
+            <w:vAlign w:val="center"/>
+          </w:tcPr>
+          <w:p>
+            <w:pPr>
+              <w:jc w:val="left"/>
+            </w:pPr>
+            <w:r>
+              <w:rPr>
+                <w:sz w:val="19"/>
+                <w:szCs w:val="19"/>
+              </w:rPr>
+              <w:t xml:space="preserve">Após o corte</w:t>
+            </w:r>
+          </w:p>
+        </w:tc>
+        <w:tc>
+          <w:tcPr>
+            <w:tcW w:type="dxa" w:w="2168"/>
+            <w:tcBorders>
+              <w:top w:val="single" w:color="A6A6A6" w:sz="4"/>
+              <w:left w:val="single" w:color="A6A6A6" w:sz="4"/>
+              <w:bottom w:val="single" w:color="A6A6A6" w:sz="4"/>
+              <w:right w:val="single" w:color="A6A6A6" w:sz="4"/>
+            </w:tcBorders>
+            <w:tcMar>
+              <w:top w:type="dxa" w:w="60"/>
+              <w:left w:type="dxa" w:w="100"/>
+              <w:bottom w:type="dxa" w:w="60"/>
+              <w:right w:type="dxa" w:w="100"/>
+            </w:tcMar>
+            <w:vAlign w:val="center"/>
+          </w:tcPr>
+          <w:p>
+            <w:pPr>
+              <w:jc w:val="left"/>
+            </w:pPr>
+            <w:r>
+              <w:rPr>
+                <w:sz w:val="19"/>
+                <w:szCs w:val="19"/>
+              </w:rPr>
+              <w:t xml:space="preserve"/>
+            </w:r>
+          </w:p>
+        </w:tc>
+      </w:tr>
+      <w:tr>
+        <w:trPr>
+          <w:cantSplit/>
+        </w:trPr>
+        <w:tc>
+          <w:tcPr>
+            <w:tcW w:type="dxa" w:w="520"/>
+            <w:tcBorders>
+              <w:top w:val="single" w:color="A6A6A6" w:sz="4"/>
+              <w:left w:val="single" w:color="A6A6A6" w:sz="4"/>
+              <w:bottom w:val="single" w:color="A6A6A6" w:sz="4"/>
+              <w:right w:val="single" w:color="A6A6A6" w:sz="4"/>
+            </w:tcBorders>
+            <w:shd w:fill="F2F2F2" w:color="auto" w:val="clear"/>
+            <w:tcMar>
+              <w:top w:type="dxa" w:w="60"/>
+              <w:left w:type="dxa" w:w="100"/>
+              <w:bottom w:type="dxa" w:w="60"/>
+              <w:right w:type="dxa" w:w="100"/>
+            </w:tcMar>
+            <w:vAlign w:val="center"/>
+          </w:tcPr>
+          <w:p>
+            <w:pPr>
+              <w:jc w:val="center"/>
+            </w:pPr>
+            <w:r>
+              <w:rPr>
+                <w:sz w:val="22"/>
+                <w:szCs w:val="22"/>
+              </w:rPr>
+              <w:t xml:space="preserve">☐</w:t>
+            </w:r>
+          </w:p>
+        </w:tc>
+        <w:tc>
+          <w:tcPr>
+            <w:tcW w:type="dxa" w:w="4700"/>
+            <w:tcBorders>
+              <w:top w:val="single" w:color="A6A6A6" w:sz="4"/>
+              <w:left w:val="single" w:color="A6A6A6" w:sz="4"/>
+              <w:bottom w:val="single" w:color="A6A6A6" w:sz="4"/>
+              <w:right w:val="single" w:color="A6A6A6" w:sz="4"/>
+            </w:tcBorders>
+            <w:shd w:fill="F2F2F2" w:color="auto" w:val="clear"/>
+            <w:tcMar>
+              <w:top w:type="dxa" w:w="60"/>
+              <w:left w:type="dxa" w:w="100"/>
+              <w:bottom w:type="dxa" w:w="60"/>
+              <w:right w:type="dxa" w:w="100"/>
+            </w:tcMar>
+            <w:vAlign w:val="center"/>
+          </w:tcPr>
+          <w:p>
+            <w:pPr>
+              <w:jc w:val="left"/>
+            </w:pPr>
+            <w:r>
+              <w:rPr>
+                <w:sz w:val="19"/>
+                <w:szCs w:val="19"/>
+              </w:rPr>
+              <w:t xml:space="preserve">Desvinculação do escritório na prefeitura onde a empresa possui cadastro municipal ([MUNICÍPIO]/SC)</w:t>
+            </w:r>
+          </w:p>
+        </w:tc>
+        <w:tc>
+          <w:tcPr>
+            <w:tcW w:type="dxa" w:w="2250"/>
+            <w:tcBorders>
+              <w:top w:val="single" w:color="A6A6A6" w:sz="4"/>
+              <w:left w:val="single" w:color="A6A6A6" w:sz="4"/>
+              <w:bottom w:val="single" w:color="A6A6A6" w:sz="4"/>
+              <w:right w:val="single" w:color="A6A6A6" w:sz="4"/>
+            </w:tcBorders>
+            <w:shd w:fill="F2F2F2" w:color="auto" w:val="clear"/>
+            <w:tcMar>
+              <w:top w:type="dxa" w:w="60"/>
+              <w:left w:type="dxa" w:w="100"/>
+              <w:bottom w:type="dxa" w:w="60"/>
+              <w:right w:type="dxa" w:w="100"/>
+            </w:tcMar>
+            <w:vAlign w:val="center"/>
+          </w:tcPr>
+          <w:p>
+            <w:pPr>
+              <w:jc w:val="left"/>
+            </w:pPr>
+            <w:r>
+              <w:rPr>
+                <w:sz w:val="19"/>
+                <w:szCs w:val="19"/>
+              </w:rPr>
+              <w:t xml:space="preserve">Após o corte</w:t>
+            </w:r>
+          </w:p>
+        </w:tc>
+        <w:tc>
+          <w:tcPr>
+            <w:tcW w:type="dxa" w:w="2168"/>
+            <w:tcBorders>
+              <w:top w:val="single" w:color="A6A6A6" w:sz="4"/>
+              <w:left w:val="single" w:color="A6A6A6" w:sz="4"/>
+              <w:bottom w:val="single" w:color="A6A6A6" w:sz="4"/>
+              <w:right w:val="single" w:color="A6A6A6" w:sz="4"/>
+            </w:tcBorders>
+            <w:shd w:fill="F2F2F2" w:color="auto" w:val="clear"/>
+            <w:tcMar>
+              <w:top w:type="dxa" w:w="60"/>
+              <w:left w:type="dxa" w:w="100"/>
+              <w:bottom w:type="dxa" w:w="60"/>
+              <w:right w:type="dxa" w:w="100"/>
+            </w:tcMar>
+            <w:vAlign w:val="center"/>
+          </w:tcPr>
+          <w:p>
+            <w:pPr>
+              <w:jc w:val="left"/>
+            </w:pPr>
+            <w:r>
+              <w:rPr>
+                <w:sz w:val="19"/>
+                <w:szCs w:val="19"/>
+              </w:rPr>
+              <w:t xml:space="preserve"/>
+            </w:r>
+          </w:p>
+        </w:tc>
+      </w:tr>
+      <w:tr>
+        <w:trPr>
+          <w:cantSplit/>
+        </w:trPr>
+        <w:tc>
+          <w:tcPr>
+            <w:tcW w:type="dxa" w:w="520"/>
+            <w:tcBorders>
+              <w:top w:val="single" w:color="A6A6A6" w:sz="4"/>
+              <w:left w:val="single" w:color="A6A6A6" w:sz="4"/>
+              <w:bottom w:val="single" w:color="A6A6A6" w:sz="4"/>
+              <w:right w:val="single" w:color="A6A6A6" w:sz="4"/>
+            </w:tcBorders>
+            <w:tcMar>
+              <w:top w:type="dxa" w:w="60"/>
+              <w:left w:type="dxa" w:w="100"/>
+              <w:bottom w:type="dxa" w:w="60"/>
+              <w:right w:type="dxa" w:w="100"/>
+            </w:tcMar>
+            <w:vAlign w:val="center"/>
+          </w:tcPr>
+          <w:p>
+            <w:pPr>
+              <w:jc w:val="center"/>
+            </w:pPr>
+            <w:r>
+              <w:rPr>
+                <w:sz w:val="22"/>
+                <w:szCs w:val="22"/>
+              </w:rPr>
+              <w:t xml:space="preserve">☐</w:t>
+            </w:r>
+          </w:p>
+        </w:tc>
+        <w:tc>
+          <w:tcPr>
+            <w:tcW w:type="dxa" w:w="4700"/>
+            <w:tcBorders>
+              <w:top w:val="single" w:color="A6A6A6" w:sz="4"/>
+              <w:left w:val="single" w:color="A6A6A6" w:sz="4"/>
+              <w:bottom w:val="single" w:color="A6A6A6" w:sz="4"/>
+              <w:right w:val="single" w:color="A6A6A6" w:sz="4"/>
+            </w:tcBorders>
+            <w:tcMar>
+              <w:top w:type="dxa" w:w="60"/>
+              <w:left w:type="dxa" w:w="100"/>
+              <w:bottom w:type="dxa" w:w="60"/>
+              <w:right w:type="dxa" w:w="100"/>
+            </w:tcMar>
+            <w:vAlign w:val="center"/>
+          </w:tcPr>
+          <w:p>
+            <w:pPr>
+              <w:jc w:val="left"/>
+            </w:pPr>
+            <w:r>
+              <w:rPr>
+                <w:sz w:val="19"/>
+                <w:szCs w:val="19"/>
+              </w:rPr>
+              <w:t xml:space="preserve">Cópia das 5 últimas DIRPF dos sócios com os respectivos recibos (se elaboradas por V.Sas.)</w:t>
+            </w:r>
+          </w:p>
+        </w:tc>
+        <w:tc>
+          <w:tcPr>
+            <w:tcW w:type="dxa" w:w="2250"/>
+            <w:tcBorders>
+              <w:top w:val="single" w:color="A6A6A6" w:sz="4"/>
+              <w:left w:val="single" w:color="A6A6A6" w:sz="4"/>
+              <w:bottom w:val="single" w:color="A6A6A6" w:sz="4"/>
+              <w:right w:val="single" w:color="A6A6A6" w:sz="4"/>
+            </w:tcBorders>
+            <w:tcMar>
+              <w:top w:type="dxa" w:w="60"/>
+              <w:left w:type="dxa" w:w="100"/>
+              <w:bottom w:type="dxa" w:w="60"/>
+              <w:right w:type="dxa" w:w="100"/>
+            </w:tcMar>
+            <w:vAlign w:val="center"/>
+          </w:tcPr>
+          <w:p>
+            <w:pPr>
+              <w:jc w:val="left"/>
+            </w:pPr>
+            <w:r>
+              <w:rPr>
+                <w:sz w:val="19"/>
+                <w:szCs w:val="19"/>
+              </w:rPr>
+              <w:t xml:space="preserve">Últimos 5 exercícios</w:t>
+            </w:r>
+          </w:p>
+        </w:tc>
+        <w:tc>
+          <w:tcPr>
+            <w:tcW w:type="dxa" w:w="2168"/>
+            <w:tcBorders>
+              <w:top w:val="single" w:color="A6A6A6" w:sz="4"/>
+              <w:left w:val="single" w:color="A6A6A6" w:sz="4"/>
+              <w:bottom w:val="single" w:color="A6A6A6" w:sz="4"/>
+              <w:right w:val="single" w:color="A6A6A6" w:sz="4"/>
+            </w:tcBorders>
+            <w:tcMar>
+              <w:top w:type="dxa" w:w="60"/>
+              <w:left w:type="dxa" w:w="100"/>
+              <w:bottom w:type="dxa" w:w="60"/>
+              <w:right w:type="dxa" w:w="100"/>
+            </w:tcMar>
+            <w:vAlign w:val="center"/>
+          </w:tcPr>
+          <w:p>
+            <w:pPr>
+              <w:jc w:val="left"/>
+            </w:pPr>
+            <w:r>
+              <w:rPr>
+                <w:sz w:val="19"/>
+                <w:szCs w:val="19"/>
+              </w:rPr>
+              <w:t xml:space="preserve"/>
+            </w:r>
+          </w:p>
+        </w:tc>
+      </w:tr>
+      <w:tr>
+        <w:trPr>
+          <w:cantSplit/>
+        </w:trPr>
+        <w:tc>
+          <w:tcPr>
+            <w:tcW w:type="dxa" w:w="520"/>
+            <w:tcBorders>
+              <w:top w:val="single" w:color="A6A6A6" w:sz="4"/>
+              <w:left w:val="single" w:color="A6A6A6" w:sz="4"/>
+              <w:bottom w:val="single" w:color="A6A6A6" w:sz="4"/>
+              <w:right w:val="single" w:color="A6A6A6" w:sz="4"/>
+            </w:tcBorders>
+            <w:shd w:fill="F2F2F2" w:color="auto" w:val="clear"/>
+            <w:tcMar>
+              <w:top w:type="dxa" w:w="60"/>
+              <w:left w:type="dxa" w:w="100"/>
+              <w:bottom w:type="dxa" w:w="60"/>
+              <w:right w:type="dxa" w:w="100"/>
+            </w:tcMar>
+            <w:vAlign w:val="center"/>
+          </w:tcPr>
+          <w:p>
+            <w:pPr>
+              <w:jc w:val="center"/>
+            </w:pPr>
+            <w:r>
+              <w:rPr>
+                <w:sz w:val="22"/>
+                <w:szCs w:val="22"/>
+              </w:rPr>
+              <w:t xml:space="preserve">☐</w:t>
+            </w:r>
+          </w:p>
+        </w:tc>
+        <w:tc>
+          <w:tcPr>
+            <w:tcW w:type="dxa" w:w="4700"/>
+            <w:tcBorders>
+              <w:top w:val="single" w:color="A6A6A6" w:sz="4"/>
+              <w:left w:val="single" w:color="A6A6A6" w:sz="4"/>
+              <w:bottom w:val="single" w:color="A6A6A6" w:sz="4"/>
+              <w:right w:val="single" w:color="A6A6A6" w:sz="4"/>
+            </w:tcBorders>
+            <w:shd w:fill="F2F2F2" w:color="auto" w:val="clear"/>
+            <w:tcMar>
+              <w:top w:type="dxa" w:w="60"/>
+              <w:left w:type="dxa" w:w="100"/>
+              <w:bottom w:type="dxa" w:w="60"/>
+              <w:right w:type="dxa" w:w="100"/>
+            </w:tcMar>
+            <w:vAlign w:val="center"/>
+          </w:tcPr>
+          <w:p>
+            <w:pPr>
+              <w:jc w:val="left"/>
+            </w:pPr>
+            <w:r>
+              <w:rPr>
+                <w:sz w:val="19"/>
+                <w:szCs w:val="19"/>
+              </w:rPr>
+              <w:t xml:space="preserve">Recibos das DIRF entregues (obrigação extinta a partir do ano-calendário 2025, substituída pela EFD-Reinf)</w:t>
+            </w:r>
+          </w:p>
+        </w:tc>
+        <w:tc>
+          <w:tcPr>
+            <w:tcW w:type="dxa" w:w="2250"/>
+            <w:tcBorders>
+              <w:top w:val="single" w:color="A6A6A6" w:sz="4"/>
+              <w:left w:val="single" w:color="A6A6A6" w:sz="4"/>
+              <w:bottom w:val="single" w:color="A6A6A6" w:sz="4"/>
+              <w:right w:val="single" w:color="A6A6A6" w:sz="4"/>
+            </w:tcBorders>
+            <w:shd w:fill="F2F2F2" w:color="auto" w:val="clear"/>
+            <w:tcMar>
+              <w:top w:type="dxa" w:w="60"/>
+              <w:left w:type="dxa" w:w="100"/>
+              <w:bottom w:type="dxa" w:w="60"/>
+              <w:right w:type="dxa" w:w="100"/>
+            </w:tcMar>
+            <w:vAlign w:val="center"/>
+          </w:tcPr>
+          <w:p>
+            <w:pPr>
+              <w:jc w:val="left"/>
+            </w:pPr>
+            <w:r>
+              <w:rPr>
+                <w:sz w:val="19"/>
+                <w:szCs w:val="19"/>
+              </w:rPr>
+              <w:t xml:space="preserve">Até o ano-base 2024</w:t>
+            </w:r>
+          </w:p>
+        </w:tc>
+        <w:tc>
+          <w:tcPr>
+            <w:tcW w:type="dxa" w:w="2168"/>
+            <w:tcBorders>
+              <w:top w:val="single" w:color="A6A6A6" w:sz="4"/>
+              <w:left w:val="single" w:color="A6A6A6" w:sz="4"/>
+              <w:bottom w:val="single" w:color="A6A6A6" w:sz="4"/>
+              <w:right w:val="single" w:color="A6A6A6" w:sz="4"/>
+            </w:tcBorders>
+            <w:shd w:fill="F2F2F2" w:color="auto" w:val="clear"/>
+            <w:tcMar>
+              <w:top w:type="dxa" w:w="60"/>
+              <w:left w:type="dxa" w:w="100"/>
+              <w:bottom w:type="dxa" w:w="60"/>
+              <w:right w:type="dxa" w:w="100"/>
+            </w:tcMar>
+            <w:vAlign w:val="center"/>
+          </w:tcPr>
+          <w:p>
+            <w:pPr>
+              <w:jc w:val="left"/>
+            </w:pPr>
+            <w:r>
+              <w:rPr>
+                <w:sz w:val="19"/>
+                <w:szCs w:val="19"/>
+              </w:rPr>
+              <w:t xml:space="preserve"/>
+            </w:r>
+          </w:p>
+        </w:tc>
+      </w:tr>
+      <w:tr>
+        <w:trPr>
+          <w:cantSplit/>
+        </w:trPr>
+        <w:tc>
+          <w:tcPr>
+            <w:tcW w:type="dxa" w:w="520"/>
+            <w:tcBorders>
+              <w:top w:val="single" w:color="A6A6A6" w:sz="4"/>
+              <w:left w:val="single" w:color="A6A6A6" w:sz="4"/>
+              <w:bottom w:val="single" w:color="A6A6A6" w:sz="4"/>
+              <w:right w:val="single" w:color="A6A6A6" w:sz="4"/>
+            </w:tcBorders>
+            <w:tcMar>
+              <w:top w:type="dxa" w:w="60"/>
+              <w:left w:type="dxa" w:w="100"/>
+              <w:bottom w:type="dxa" w:w="60"/>
+              <w:right w:type="dxa" w:w="100"/>
+            </w:tcMar>
+            <w:vAlign w:val="center"/>
+          </w:tcPr>
+          <w:p>
+            <w:pPr>
+              <w:jc w:val="center"/>
+            </w:pPr>
+            <w:r>
+              <w:rPr>
+                <w:sz w:val="22"/>
+                <w:szCs w:val="22"/>
+              </w:rPr>
+              <w:t xml:space="preserve">☐</w:t>
+            </w:r>
+          </w:p>
+        </w:tc>
+        <w:tc>
+          <w:tcPr>
+            <w:tcW w:type="dxa" w:w="4700"/>
+            <w:tcBorders>
+              <w:top w:val="single" w:color="A6A6A6" w:sz="4"/>
+              <w:left w:val="single" w:color="A6A6A6" w:sz="4"/>
+              <w:bottom w:val="single" w:color="A6A6A6" w:sz="4"/>
+              <w:right w:val="single" w:color="A6A6A6" w:sz="4"/>
+            </w:tcBorders>
+            <w:tcMar>
+              <w:top w:type="dxa" w:w="60"/>
+              <w:left w:type="dxa" w:w="100"/>
+              <w:bottom w:type="dxa" w:w="60"/>
+              <w:right w:type="dxa" w:w="100"/>
+            </w:tcMar>
+            <w:vAlign w:val="center"/>
+          </w:tcPr>
+          <w:p>
+            <w:pPr>
+              <w:jc w:val="left"/>
+            </w:pPr>
+            <w:r>
+              <w:rPr>
+                <w:sz w:val="19"/>
+                <w:szCs w:val="19"/>
+              </w:rPr>
               <w:t xml:space="preserve">Fiscalizações, intimações, autos de infração e processos administrativos ou judiciais em andamento</w:t>
             </w:r>
           </w:p>
@@ -3580,7 +4702,6 @@
               <w:bottom w:val="single" w:color="A6A6A6" w:sz="4"/>
               <w:right w:val="single" w:color="A6A6A6" w:sz="4"/>
             </w:tcBorders>
-            <w:shd w:fill="F2F2F2" w:color="auto" w:val="clear"/>
             <w:tcMar>
               <w:top w:type="dxa" w:w="60"/>
               <w:left w:type="dxa" w:w="100"/>
@@ -3611,7 +4732,6 @@
               <w:bottom w:val="single" w:color="A6A6A6" w:sz="4"/>
               <w:right w:val="single" w:color="A6A6A6" w:sz="4"/>
             </w:tcBorders>
-            <w:shd w:fill="F2F2F2" w:color="auto" w:val="clear"/>
             <w:tcMar>
               <w:top w:type="dxa" w:w="60"/>
               <w:left w:type="dxa" w:w="100"/>
@@ -3642,7 +4762,7 @@
         <w:spacing w:after="120" w:before="280"/>
       </w:pPr>
       <w:r>
-        <w:t xml:space="preserve">3. Departamento Pessoal</w:t>
+        <w:t xml:space="preserve">3. Departamento Pessoal — PRIORITÁRIO</w:t>
       </w:r>
     </w:p>
     <w:tbl>
@@ -4372,7 +5492,7 @@
                 <w:sz w:val="19"/>
                 <w:szCs w:val="19"/>
               </w:rPr>
-              <w:t xml:space="preserve">Folha de pagamento (analítica e resumo) e holerites</w:t>
+              <w:t xml:space="preserve">Resumo da folha de pagamento e holerites</w:t>
             </w:r>
           </w:p>
         </w:tc>
@@ -4499,7 +5619,7 @@
                 <w:sz w:val="19"/>
                 <w:szCs w:val="19"/>
               </w:rPr>
-              <w:t xml:space="preserve">Avisos e recibos de férias</w:t>
+              <w:t xml:space="preserve">Espelho da folha do mês anterior ao corte</w:t>
             </w:r>
           </w:p>
         </w:tc>
@@ -4530,7 +5650,7 @@
                 <w:sz w:val="19"/>
                 <w:szCs w:val="19"/>
               </w:rPr>
-              <w:t xml:space="preserve">Período de histórico</w:t>
+              <w:t xml:space="preserve">Mês anterior ao corte</w:t>
             </w:r>
           </w:p>
         </w:tc>
@@ -4626,7 +5746,7 @@
                 <w:sz w:val="19"/>
                 <w:szCs w:val="19"/>
               </w:rPr>
-              <w:t xml:space="preserve">Relatório de períodos aquisitivos de férias (vencidas e a vencer) e provisões de férias e 13º</w:t>
+              <w:t xml:space="preserve">Avisos e recibos de férias</w:t>
             </w:r>
           </w:p>
         </w:tc>
@@ -4656,7 +5776,7 @@
                 <w:sz w:val="19"/>
                 <w:szCs w:val="19"/>
               </w:rPr>
-              <w:t xml:space="preserve">Data/competência de corte</w:t>
+              <w:t xml:space="preserve">Período de histórico</w:t>
             </w:r>
           </w:p>
         </w:tc>
@@ -4753,7 +5873,7 @@
                 <w:sz w:val="19"/>
                 <w:szCs w:val="19"/>
               </w:rPr>
-              <w:t xml:space="preserve">Relação de contratos de experiência / prazo determinado a vencer</w:t>
+              <w:t xml:space="preserve">Relatório de períodos aquisitivos de férias (vencidas e a vencer) e provisões de férias e 13º</w:t>
             </w:r>
           </w:p>
         </w:tc>
@@ -4784,7 +5904,7 @@
                 <w:sz w:val="19"/>
                 <w:szCs w:val="19"/>
               </w:rPr>
-              <w:t xml:space="preserve">Vigentes</w:t>
+              <w:t xml:space="preserve">Data/competência de corte</w:t>
             </w:r>
           </w:p>
         </w:tc>
@@ -4880,7 +6000,7 @@
                 <w:sz w:val="19"/>
                 <w:szCs w:val="19"/>
               </w:rPr>
-              <w:t xml:space="preserve">Dependentes para salário-família e IRRF; pensões alimentícias (ofício judicial)</w:t>
+              <w:t xml:space="preserve">Relação de contratos de experiência / prazo determinado a vencer</w:t>
             </w:r>
           </w:p>
         </w:tc>
@@ -4910,7 +6030,7 @@
                 <w:sz w:val="19"/>
                 <w:szCs w:val="19"/>
               </w:rPr>
-              <w:t xml:space="preserve">Atual</w:t>
+              <w:t xml:space="preserve">Vigentes</w:t>
             </w:r>
           </w:p>
         </w:tc>
@@ -5007,7 +6127,7 @@
                 <w:sz w:val="19"/>
                 <w:szCs w:val="19"/>
               </w:rPr>
-              <w:t xml:space="preserve">Afastamentos em curso (auxílio-doença, acidente, licença-maternidade) e estabilidades</w:t>
+              <w:t xml:space="preserve">Dependentes para salário-família e IRRF; pensões alimentícias (ofício judicial)</w:t>
             </w:r>
           </w:p>
         </w:tc>
@@ -5134,7 +6254,7 @@
                 <w:sz w:val="19"/>
                 <w:szCs w:val="19"/>
               </w:rPr>
-              <w:t xml:space="preserve">Convenção coletiva aplicável, sindicato, data-base, acordos de banco de horas e de compensação</w:t>
+              <w:t xml:space="preserve">Afastamentos em curso (auxílio-doença, acidente, licença-maternidade) e estabilidades</w:t>
             </w:r>
           </w:p>
         </w:tc>
@@ -5164,7 +6284,7 @@
                 <w:sz w:val="19"/>
                 <w:szCs w:val="19"/>
               </w:rPr>
-              <w:t xml:space="preserve">Vigentes</w:t>
+              <w:t xml:space="preserve">Atual</w:t>
             </w:r>
           </w:p>
         </w:tc>
@@ -5261,7 +6381,7 @@
                 <w:sz w:val="19"/>
                 <w:szCs w:val="19"/>
               </w:rPr>
-              <w:t xml:space="preserve">Benefícios: VT, VA/VR, plano de saúde, consignados (Crédito do Trabalhador) e PAT (inscrição: CPF e senha)</w:t>
+              <w:t xml:space="preserve">Convenção coletiva aplicável, sindicato, data-base, acordos de banco de horas e de compensação</w:t>
             </w:r>
           </w:p>
         </w:tc>
@@ -5388,7 +6508,7 @@
                 <w:sz w:val="19"/>
                 <w:szCs w:val="19"/>
               </w:rPr>
-              <w:t xml:space="preserve">SST: PGR, PCMSO, LTCAT, ASOs e situação dos eventos S-2210/S-2220/S-2240</w:t>
+              <w:t xml:space="preserve">Benefícios: VT, VA/VR, plano de saúde, consignados (Crédito do Trabalhador) e PAT (inscrição: CPF e senha)</w:t>
             </w:r>
           </w:p>
         </w:tc>
@@ -5515,7 +6635,7 @@
                 <w:sz w:val="19"/>
                 <w:szCs w:val="19"/>
               </w:rPr>
-              <w:t xml:space="preserve">eSocial: confirmação do S-1299 e do envio do S-1210 (pagamentos) pela contabilidade anterior; relação de eventos pendentes ou rejeitados</w:t>
+              <w:t xml:space="preserve">SST: PGR, PCMSO, LTCAT, ASOs e situação dos eventos S-2210/S-2220/S-2240</w:t>
             </w:r>
           </w:p>
         </w:tc>
@@ -5546,7 +6666,7 @@
                 <w:sz w:val="19"/>
                 <w:szCs w:val="19"/>
               </w:rPr>
-              <w:t xml:space="preserve">Até a competência de corte</w:t>
+              <w:t xml:space="preserve">Vigentes</w:t>
             </w:r>
           </w:p>
         </w:tc>
@@ -5642,7 +6762,7 @@
                 <w:sz w:val="19"/>
                 <w:szCs w:val="19"/>
               </w:rPr>
-              <w:t xml:space="preserve">Guias e comprovantes do FGTS Digital e DCTFWeb (INSS/IRRF)</w:t>
+              <w:t xml:space="preserve">eSocial: confirmação do S-1299 e do envio do S-1210 (pagamentos) pela contabilidade anterior; relação de eventos pendentes ou rejeitados</w:t>
             </w:r>
           </w:p>
         </w:tc>
@@ -5672,7 +6792,7 @@
                 <w:sz w:val="19"/>
                 <w:szCs w:val="19"/>
               </w:rPr>
-              <w:t xml:space="preserve">Período de histórico</w:t>
+              <w:t xml:space="preserve">Até a competência de corte</w:t>
             </w:r>
           </w:p>
         </w:tc>
@@ -5769,7 +6889,7 @@
                 <w:sz w:val="19"/>
                 <w:szCs w:val="19"/>
               </w:rPr>
-              <w:t xml:space="preserve">Pró-labore dos sócios e RPAs de autônomos pagos</w:t>
+              <w:t xml:space="preserve">Recibos da RAIS dos anos-base em que foi entregue (hoje substituída pelo eSocial)</w:t>
             </w:r>
           </w:p>
         </w:tc>
@@ -5800,7 +6920,7 @@
                 <w:sz w:val="19"/>
                 <w:szCs w:val="19"/>
               </w:rPr>
-              <w:t xml:space="preserve">Período de histórico</w:t>
+              <w:t xml:space="preserve">Últimos 5 anos</w:t>
             </w:r>
           </w:p>
         </w:tc>
@@ -5896,7 +7016,7 @@
                 <w:sz w:val="19"/>
                 <w:szCs w:val="19"/>
               </w:rPr>
-              <w:t xml:space="preserve">Acesso ao Empregador Web (Seguro-Desemprego)</w:t>
+              <w:t xml:space="preserve">Guias e comprovantes do FGTS Digital e DCTFWeb (INSS/IRRF)</w:t>
             </w:r>
           </w:p>
         </w:tc>
@@ -5926,6 +7046,260 @@
                 <w:sz w:val="19"/>
                 <w:szCs w:val="19"/>
               </w:rPr>
+              <w:t xml:space="preserve">Período de histórico</w:t>
+            </w:r>
+          </w:p>
+        </w:tc>
+        <w:tc>
+          <w:tcPr>
+            <w:tcW w:type="dxa" w:w="2168"/>
+            <w:tcBorders>
+              <w:top w:val="single" w:color="A6A6A6" w:sz="4"/>
+              <w:left w:val="single" w:color="A6A6A6" w:sz="4"/>
+              <w:bottom w:val="single" w:color="A6A6A6" w:sz="4"/>
+              <w:right w:val="single" w:color="A6A6A6" w:sz="4"/>
+            </w:tcBorders>
+            <w:tcMar>
+              <w:top w:type="dxa" w:w="60"/>
+              <w:left w:type="dxa" w:w="100"/>
+              <w:bottom w:type="dxa" w:w="60"/>
+              <w:right w:type="dxa" w:w="100"/>
+            </w:tcMar>
+            <w:vAlign w:val="center"/>
+          </w:tcPr>
+          <w:p>
+            <w:pPr>
+              <w:jc w:val="left"/>
+            </w:pPr>
+            <w:r>
+              <w:rPr>
+                <w:sz w:val="19"/>
+                <w:szCs w:val="19"/>
+              </w:rPr>
+              <w:t xml:space="preserve"/>
+            </w:r>
+          </w:p>
+        </w:tc>
+      </w:tr>
+      <w:tr>
+        <w:trPr>
+          <w:cantSplit/>
+        </w:trPr>
+        <w:tc>
+          <w:tcPr>
+            <w:tcW w:type="dxa" w:w="520"/>
+            <w:tcBorders>
+              <w:top w:val="single" w:color="A6A6A6" w:sz="4"/>
+              <w:left w:val="single" w:color="A6A6A6" w:sz="4"/>
+              <w:bottom w:val="single" w:color="A6A6A6" w:sz="4"/>
+              <w:right w:val="single" w:color="A6A6A6" w:sz="4"/>
+            </w:tcBorders>
+            <w:shd w:fill="F2F2F2" w:color="auto" w:val="clear"/>
+            <w:tcMar>
+              <w:top w:type="dxa" w:w="60"/>
+              <w:left w:type="dxa" w:w="100"/>
+              <w:bottom w:type="dxa" w:w="60"/>
+              <w:right w:type="dxa" w:w="100"/>
+            </w:tcMar>
+            <w:vAlign w:val="center"/>
+          </w:tcPr>
+          <w:p>
+            <w:pPr>
+              <w:jc w:val="center"/>
+            </w:pPr>
+            <w:r>
+              <w:rPr>
+                <w:sz w:val="22"/>
+                <w:szCs w:val="22"/>
+              </w:rPr>
+              <w:t xml:space="preserve">☐</w:t>
+            </w:r>
+          </w:p>
+        </w:tc>
+        <w:tc>
+          <w:tcPr>
+            <w:tcW w:type="dxa" w:w="4700"/>
+            <w:tcBorders>
+              <w:top w:val="single" w:color="A6A6A6" w:sz="4"/>
+              <w:left w:val="single" w:color="A6A6A6" w:sz="4"/>
+              <w:bottom w:val="single" w:color="A6A6A6" w:sz="4"/>
+              <w:right w:val="single" w:color="A6A6A6" w:sz="4"/>
+            </w:tcBorders>
+            <w:shd w:fill="F2F2F2" w:color="auto" w:val="clear"/>
+            <w:tcMar>
+              <w:top w:type="dxa" w:w="60"/>
+              <w:left w:type="dxa" w:w="100"/>
+              <w:bottom w:type="dxa" w:w="60"/>
+              <w:right w:type="dxa" w:w="100"/>
+            </w:tcMar>
+            <w:vAlign w:val="center"/>
+          </w:tcPr>
+          <w:p>
+            <w:pPr>
+              <w:jc w:val="left"/>
+            </w:pPr>
+            <w:r>
+              <w:rPr>
+                <w:sz w:val="19"/>
+                <w:szCs w:val="19"/>
+              </w:rPr>
+              <w:t xml:space="preserve">Pró-labore dos sócios e RPAs de autônomos pagos</w:t>
+            </w:r>
+          </w:p>
+        </w:tc>
+        <w:tc>
+          <w:tcPr>
+            <w:tcW w:type="dxa" w:w="2250"/>
+            <w:tcBorders>
+              <w:top w:val="single" w:color="A6A6A6" w:sz="4"/>
+              <w:left w:val="single" w:color="A6A6A6" w:sz="4"/>
+              <w:bottom w:val="single" w:color="A6A6A6" w:sz="4"/>
+              <w:right w:val="single" w:color="A6A6A6" w:sz="4"/>
+            </w:tcBorders>
+            <w:shd w:fill="F2F2F2" w:color="auto" w:val="clear"/>
+            <w:tcMar>
+              <w:top w:type="dxa" w:w="60"/>
+              <w:left w:type="dxa" w:w="100"/>
+              <w:bottom w:type="dxa" w:w="60"/>
+              <w:right w:type="dxa" w:w="100"/>
+            </w:tcMar>
+            <w:vAlign w:val="center"/>
+          </w:tcPr>
+          <w:p>
+            <w:pPr>
+              <w:jc w:val="left"/>
+            </w:pPr>
+            <w:r>
+              <w:rPr>
+                <w:sz w:val="19"/>
+                <w:szCs w:val="19"/>
+              </w:rPr>
+              <w:t xml:space="preserve">Período de histórico</w:t>
+            </w:r>
+          </w:p>
+        </w:tc>
+        <w:tc>
+          <w:tcPr>
+            <w:tcW w:type="dxa" w:w="2168"/>
+            <w:tcBorders>
+              <w:top w:val="single" w:color="A6A6A6" w:sz="4"/>
+              <w:left w:val="single" w:color="A6A6A6" w:sz="4"/>
+              <w:bottom w:val="single" w:color="A6A6A6" w:sz="4"/>
+              <w:right w:val="single" w:color="A6A6A6" w:sz="4"/>
+            </w:tcBorders>
+            <w:shd w:fill="F2F2F2" w:color="auto" w:val="clear"/>
+            <w:tcMar>
+              <w:top w:type="dxa" w:w="60"/>
+              <w:left w:type="dxa" w:w="100"/>
+              <w:bottom w:type="dxa" w:w="60"/>
+              <w:right w:type="dxa" w:w="100"/>
+            </w:tcMar>
+            <w:vAlign w:val="center"/>
+          </w:tcPr>
+          <w:p>
+            <w:pPr>
+              <w:jc w:val="left"/>
+            </w:pPr>
+            <w:r>
+              <w:rPr>
+                <w:sz w:val="19"/>
+                <w:szCs w:val="19"/>
+              </w:rPr>
+              <w:t xml:space="preserve"/>
+            </w:r>
+          </w:p>
+        </w:tc>
+      </w:tr>
+      <w:tr>
+        <w:trPr>
+          <w:cantSplit/>
+        </w:trPr>
+        <w:tc>
+          <w:tcPr>
+            <w:tcW w:type="dxa" w:w="520"/>
+            <w:tcBorders>
+              <w:top w:val="single" w:color="A6A6A6" w:sz="4"/>
+              <w:left w:val="single" w:color="A6A6A6" w:sz="4"/>
+              <w:bottom w:val="single" w:color="A6A6A6" w:sz="4"/>
+              <w:right w:val="single" w:color="A6A6A6" w:sz="4"/>
+            </w:tcBorders>
+            <w:tcMar>
+              <w:top w:type="dxa" w:w="60"/>
+              <w:left w:type="dxa" w:w="100"/>
+              <w:bottom w:type="dxa" w:w="60"/>
+              <w:right w:type="dxa" w:w="100"/>
+            </w:tcMar>
+            <w:vAlign w:val="center"/>
+          </w:tcPr>
+          <w:p>
+            <w:pPr>
+              <w:jc w:val="center"/>
+            </w:pPr>
+            <w:r>
+              <w:rPr>
+                <w:sz w:val="22"/>
+                <w:szCs w:val="22"/>
+              </w:rPr>
+              <w:t xml:space="preserve">☐</w:t>
+            </w:r>
+          </w:p>
+        </w:tc>
+        <w:tc>
+          <w:tcPr>
+            <w:tcW w:type="dxa" w:w="4700"/>
+            <w:tcBorders>
+              <w:top w:val="single" w:color="A6A6A6" w:sz="4"/>
+              <w:left w:val="single" w:color="A6A6A6" w:sz="4"/>
+              <w:bottom w:val="single" w:color="A6A6A6" w:sz="4"/>
+              <w:right w:val="single" w:color="A6A6A6" w:sz="4"/>
+            </w:tcBorders>
+            <w:tcMar>
+              <w:top w:type="dxa" w:w="60"/>
+              <w:left w:type="dxa" w:w="100"/>
+              <w:bottom w:type="dxa" w:w="60"/>
+              <w:right w:type="dxa" w:w="100"/>
+            </w:tcMar>
+            <w:vAlign w:val="center"/>
+          </w:tcPr>
+          <w:p>
+            <w:pPr>
+              <w:jc w:val="left"/>
+            </w:pPr>
+            <w:r>
+              <w:rPr>
+                <w:sz w:val="19"/>
+                <w:szCs w:val="19"/>
+              </w:rPr>
+              <w:t xml:space="preserve">Seguro-Desemprego (Empregador Web): login e senha</w:t>
+            </w:r>
+          </w:p>
+        </w:tc>
+        <w:tc>
+          <w:tcPr>
+            <w:tcW w:type="dxa" w:w="2250"/>
+            <w:tcBorders>
+              <w:top w:val="single" w:color="A6A6A6" w:sz="4"/>
+              <w:left w:val="single" w:color="A6A6A6" w:sz="4"/>
+              <w:bottom w:val="single" w:color="A6A6A6" w:sz="4"/>
+              <w:right w:val="single" w:color="A6A6A6" w:sz="4"/>
+            </w:tcBorders>
+            <w:tcMar>
+              <w:top w:type="dxa" w:w="60"/>
+              <w:left w:type="dxa" w:w="100"/>
+              <w:bottom w:type="dxa" w:w="60"/>
+              <w:right w:type="dxa" w:w="100"/>
+            </w:tcMar>
+            <w:vAlign w:val="center"/>
+          </w:tcPr>
+          <w:p>
+            <w:pPr>
+              <w:jc w:val="left"/>
+            </w:pPr>
+            <w:r>
+              <w:rPr>
+                <w:sz w:val="19"/>
+                <w:szCs w:val="19"/>
+              </w:rPr>
               <w:t xml:space="preserve">Atual</w:t>
             </w:r>
           </w:p>
@@ -5939,6 +7313,135 @@
               <w:bottom w:val="single" w:color="A6A6A6" w:sz="4"/>
               <w:right w:val="single" w:color="A6A6A6" w:sz="4"/>
             </w:tcBorders>
+            <w:tcMar>
+              <w:top w:type="dxa" w:w="60"/>
+              <w:left w:type="dxa" w:w="100"/>
+              <w:bottom w:type="dxa" w:w="60"/>
+              <w:right w:type="dxa" w:w="100"/>
+            </w:tcMar>
+            <w:vAlign w:val="center"/>
+          </w:tcPr>
+          <w:p>
+            <w:pPr>
+              <w:jc w:val="left"/>
+            </w:pPr>
+            <w:r>
+              <w:rPr>
+                <w:sz w:val="19"/>
+                <w:szCs w:val="19"/>
+              </w:rPr>
+              <w:t xml:space="preserve"/>
+            </w:r>
+          </w:p>
+        </w:tc>
+      </w:tr>
+      <w:tr>
+        <w:trPr>
+          <w:cantSplit/>
+        </w:trPr>
+        <w:tc>
+          <w:tcPr>
+            <w:tcW w:type="dxa" w:w="520"/>
+            <w:tcBorders>
+              <w:top w:val="single" w:color="A6A6A6" w:sz="4"/>
+              <w:left w:val="single" w:color="A6A6A6" w:sz="4"/>
+              <w:bottom w:val="single" w:color="A6A6A6" w:sz="4"/>
+              <w:right w:val="single" w:color="A6A6A6" w:sz="4"/>
+            </w:tcBorders>
+            <w:shd w:fill="F2F2F2" w:color="auto" w:val="clear"/>
+            <w:tcMar>
+              <w:top w:type="dxa" w:w="60"/>
+              <w:left w:type="dxa" w:w="100"/>
+              <w:bottom w:type="dxa" w:w="60"/>
+              <w:right w:type="dxa" w:w="100"/>
+            </w:tcMar>
+            <w:vAlign w:val="center"/>
+          </w:tcPr>
+          <w:p>
+            <w:pPr>
+              <w:jc w:val="center"/>
+            </w:pPr>
+            <w:r>
+              <w:rPr>
+                <w:sz w:val="22"/>
+                <w:szCs w:val="22"/>
+              </w:rPr>
+              <w:t xml:space="preserve">☐</w:t>
+            </w:r>
+          </w:p>
+        </w:tc>
+        <w:tc>
+          <w:tcPr>
+            <w:tcW w:type="dxa" w:w="4700"/>
+            <w:tcBorders>
+              <w:top w:val="single" w:color="A6A6A6" w:sz="4"/>
+              <w:left w:val="single" w:color="A6A6A6" w:sz="4"/>
+              <w:bottom w:val="single" w:color="A6A6A6" w:sz="4"/>
+              <w:right w:val="single" w:color="A6A6A6" w:sz="4"/>
+            </w:tcBorders>
+            <w:shd w:fill="F2F2F2" w:color="auto" w:val="clear"/>
+            <w:tcMar>
+              <w:top w:type="dxa" w:w="60"/>
+              <w:left w:type="dxa" w:w="100"/>
+              <w:bottom w:type="dxa" w:w="60"/>
+              <w:right w:type="dxa" w:w="100"/>
+            </w:tcMar>
+            <w:vAlign w:val="center"/>
+          </w:tcPr>
+          <w:p>
+            <w:pPr>
+              <w:jc w:val="left"/>
+            </w:pPr>
+            <w:r>
+              <w:rPr>
+                <w:sz w:val="19"/>
+                <w:szCs w:val="19"/>
+              </w:rPr>
+              <w:t xml:space="preserve">Empregador cadastrado (nome e CPF/CNPJ), quando diferente da empresa</w:t>
+            </w:r>
+          </w:p>
+        </w:tc>
+        <w:tc>
+          <w:tcPr>
+            <w:tcW w:type="dxa" w:w="2250"/>
+            <w:tcBorders>
+              <w:top w:val="single" w:color="A6A6A6" w:sz="4"/>
+              <w:left w:val="single" w:color="A6A6A6" w:sz="4"/>
+              <w:bottom w:val="single" w:color="A6A6A6" w:sz="4"/>
+              <w:right w:val="single" w:color="A6A6A6" w:sz="4"/>
+            </w:tcBorders>
+            <w:shd w:fill="F2F2F2" w:color="auto" w:val="clear"/>
+            <w:tcMar>
+              <w:top w:type="dxa" w:w="60"/>
+              <w:left w:type="dxa" w:w="100"/>
+              <w:bottom w:type="dxa" w:w="60"/>
+              <w:right w:type="dxa" w:w="100"/>
+            </w:tcMar>
+            <w:vAlign w:val="center"/>
+          </w:tcPr>
+          <w:p>
+            <w:pPr>
+              <w:jc w:val="left"/>
+            </w:pPr>
+            <w:r>
+              <w:rPr>
+                <w:sz w:val="19"/>
+                <w:szCs w:val="19"/>
+              </w:rPr>
+              <w:t xml:space="preserve">Atual</w:t>
+            </w:r>
+          </w:p>
+        </w:tc>
+        <w:tc>
+          <w:tcPr>
+            <w:tcW w:type="dxa" w:w="2168"/>
+            <w:tcBorders>
+              <w:top w:val="single" w:color="A6A6A6" w:sz="4"/>
+              <w:left w:val="single" w:color="A6A6A6" w:sz="4"/>
+              <w:bottom w:val="single" w:color="A6A6A6" w:sz="4"/>
+              <w:right w:val="single" w:color="A6A6A6" w:sz="4"/>
+            </w:tcBorders>
+            <w:shd w:fill="F2F2F2" w:color="auto" w:val="clear"/>
             <w:tcMar>
               <w:top w:type="dxa" w:w="60"/>
               <w:left w:type="dxa" w:w="100"/>
@@ -6191,7 +7694,7 @@
                 <w:sz w:val="19"/>
                 <w:szCs w:val="19"/>
               </w:rPr>
-              <w:t xml:space="preserve">Balancete de verificação encerrado na data de corte (saldos de abertura para nossa escrituração)</w:t>
+              <w:t xml:space="preserve">Balancete atualizado, sem zeramento, encerrado na data de corte (implantação de saldos)</w:t>
             </w:r>
           </w:p>
         </w:tc>
@@ -6318,7 +7821,7 @@
                 <w:sz w:val="19"/>
                 <w:szCs w:val="19"/>
               </w:rPr>
-              <w:t xml:space="preserve">Balanço Patrimonial, DRE, DLPA/DMPL e notas explicativas</w:t>
+              <w:t xml:space="preserve">SPED Contábil (ECD) do período já escriturado no exercício, quando a troca ocorrer no decorrer do ano</w:t>
             </w:r>
           </w:p>
         </w:tc>
@@ -6349,7 +7852,7 @@
                 <w:sz w:val="19"/>
                 <w:szCs w:val="19"/>
               </w:rPr>
-              <w:t xml:space="preserve">Último exercício encerrado</w:t>
+              <w:t xml:space="preserve">Exercício corrente</w:t>
             </w:r>
           </w:p>
         </w:tc>
@@ -6445,7 +7948,7 @@
                 <w:sz w:val="19"/>
                 <w:szCs w:val="19"/>
               </w:rPr>
-              <w:t xml:space="preserve">Livros Diário e Razão (ECD) com recibos de transmissão</w:t>
+              <w:t xml:space="preserve">Balanço Patrimonial, DRE, DLPA/DMPL e notas explicativas</w:t>
             </w:r>
           </w:p>
         </w:tc>
@@ -6475,7 +7978,7 @@
                 <w:sz w:val="19"/>
                 <w:szCs w:val="19"/>
               </w:rPr>
-              <w:t xml:space="preserve">Últimos 5 anos</w:t>
+              <w:t xml:space="preserve">Último exercício encerrado</w:t>
             </w:r>
           </w:p>
         </w:tc>
@@ -6572,7 +8075,7 @@
                 <w:sz w:val="19"/>
                 <w:szCs w:val="19"/>
               </w:rPr>
-              <w:t xml:space="preserve">Plano de contas e exportação dos lançamentos do exercício corrente (TXT/SPED ou planilha)</w:t>
+              <w:t xml:space="preserve">Todos os Livros Diário, Balanços e DREs autenticados / assinados digitalmente (ECD com recibos)</w:t>
             </w:r>
           </w:p>
         </w:tc>
@@ -6603,7 +8106,7 @@
                 <w:sz w:val="19"/>
                 <w:szCs w:val="19"/>
               </w:rPr>
-              <w:t xml:space="preserve">Exercício corrente</w:t>
+              <w:t xml:space="preserve">Últimos 5 anos</w:t>
             </w:r>
           </w:p>
         </w:tc>
@@ -6699,7 +8202,7 @@
                 <w:sz w:val="19"/>
                 <w:szCs w:val="19"/>
               </w:rPr>
-              <w:t xml:space="preserve">Conciliações e composição de saldos: bancos (com extratos), aplicações, clientes, fornecedores, empréstimos, tributos a recolher, adiantamentos e provisões</w:t>
+              <w:t xml:space="preserve">Plano de contas e exportação dos lançamentos do exercício corrente (TXT/SPED ou planilha)</w:t>
             </w:r>
           </w:p>
         </w:tc>
@@ -6729,7 +8232,7 @@
                 <w:sz w:val="19"/>
                 <w:szCs w:val="19"/>
               </w:rPr>
-              <w:t xml:space="preserve">Data/competência de corte</w:t>
+              <w:t xml:space="preserve">Exercício corrente</w:t>
             </w:r>
           </w:p>
         </w:tc>
@@ -6826,7 +8329,7 @@
                 <w:sz w:val="19"/>
                 <w:szCs w:val="19"/>
               </w:rPr>
-              <w:t xml:space="preserve">Relação de bens do imobilizado com notas de aquisição e controle de depreciação</w:t>
+              <w:t xml:space="preserve">Conciliações e composição de saldos: bancos (com extratos), aplicações, clientes, fornecedores, empréstimos, tributos a recolher, adiantamentos e provisões</w:t>
             </w:r>
           </w:p>
         </w:tc>
@@ -6953,7 +8456,7 @@
                 <w:sz w:val="19"/>
                 <w:szCs w:val="19"/>
               </w:rPr>
-              <w:t xml:space="preserve">Inventário / controle de estoque, se houver</w:t>
+              <w:t xml:space="preserve">Relação do imobilizado, ficha de ativos e ficha auxiliar de ativos (aquisição e depreciação)</w:t>
             </w:r>
           </w:p>
         </w:tc>
@@ -6983,7 +8486,7 @@
                 <w:sz w:val="19"/>
                 <w:szCs w:val="19"/>
               </w:rPr>
-              <w:t xml:space="preserve">Último 31/12 + data de corte</w:t>
+              <w:t xml:space="preserve">Data/competência de corte</w:t>
             </w:r>
           </w:p>
         </w:tc>
@@ -7080,7 +8583,7 @@
                 <w:sz w:val="19"/>
                 <w:szCs w:val="19"/>
               </w:rPr>
-              <w:t xml:space="preserve">Contratos relevantes: empréstimos/financiamentos, leasing, consórcios, locação, mútuos com sócios</w:t>
+              <w:t xml:space="preserve">Inventário / controle de estoque, se houver</w:t>
             </w:r>
           </w:p>
         </w:tc>
@@ -7111,7 +8614,7 @@
                 <w:sz w:val="19"/>
                 <w:szCs w:val="19"/>
               </w:rPr>
-              <w:t xml:space="preserve">Vigentes</w:t>
+              <w:t xml:space="preserve">Último 31/12 + data de corte</w:t>
             </w:r>
           </w:p>
         </w:tc>
@@ -7207,7 +8710,7 @@
                 <w:sz w:val="19"/>
                 <w:szCs w:val="19"/>
               </w:rPr>
-              <w:t xml:space="preserve">Distribuição de lucros: valores pagos por sócio e base de cálculo</w:t>
+              <w:t xml:space="preserve">Contratos relevantes: empréstimos/financiamentos, leasing, consórcios, locação, mútuos com sócios</w:t>
             </w:r>
           </w:p>
         </w:tc>
@@ -7237,7 +8740,7 @@
                 <w:sz w:val="19"/>
                 <w:szCs w:val="19"/>
               </w:rPr>
-              <w:t xml:space="preserve">Exercício corrente e anterior</w:t>
+              <w:t xml:space="preserve">Vigentes</w:t>
             </w:r>
           </w:p>
         </w:tc>
@@ -7334,6 +8837,133 @@
                 <w:sz w:val="19"/>
                 <w:szCs w:val="19"/>
               </w:rPr>
+              <w:t xml:space="preserve">Distribuição de lucros: valores pagos por sócio e base de cálculo</w:t>
+            </w:r>
+          </w:p>
+        </w:tc>
+        <w:tc>
+          <w:tcPr>
+            <w:tcW w:type="dxa" w:w="2250"/>
+            <w:tcBorders>
+              <w:top w:val="single" w:color="A6A6A6" w:sz="4"/>
+              <w:left w:val="single" w:color="A6A6A6" w:sz="4"/>
+              <w:bottom w:val="single" w:color="A6A6A6" w:sz="4"/>
+              <w:right w:val="single" w:color="A6A6A6" w:sz="4"/>
+            </w:tcBorders>
+            <w:shd w:fill="F2F2F2" w:color="auto" w:val="clear"/>
+            <w:tcMar>
+              <w:top w:type="dxa" w:w="60"/>
+              <w:left w:type="dxa" w:w="100"/>
+              <w:bottom w:type="dxa" w:w="60"/>
+              <w:right w:type="dxa" w:w="100"/>
+            </w:tcMar>
+            <w:vAlign w:val="center"/>
+          </w:tcPr>
+          <w:p>
+            <w:pPr>
+              <w:jc w:val="left"/>
+            </w:pPr>
+            <w:r>
+              <w:rPr>
+                <w:sz w:val="19"/>
+                <w:szCs w:val="19"/>
+              </w:rPr>
+              <w:t xml:space="preserve">Exercício corrente e anterior</w:t>
+            </w:r>
+          </w:p>
+        </w:tc>
+        <w:tc>
+          <w:tcPr>
+            <w:tcW w:type="dxa" w:w="2168"/>
+            <w:tcBorders>
+              <w:top w:val="single" w:color="A6A6A6" w:sz="4"/>
+              <w:left w:val="single" w:color="A6A6A6" w:sz="4"/>
+              <w:bottom w:val="single" w:color="A6A6A6" w:sz="4"/>
+              <w:right w:val="single" w:color="A6A6A6" w:sz="4"/>
+            </w:tcBorders>
+            <w:shd w:fill="F2F2F2" w:color="auto" w:val="clear"/>
+            <w:tcMar>
+              <w:top w:type="dxa" w:w="60"/>
+              <w:left w:type="dxa" w:w="100"/>
+              <w:bottom w:type="dxa" w:w="60"/>
+              <w:right w:type="dxa" w:w="100"/>
+            </w:tcMar>
+            <w:vAlign w:val="center"/>
+          </w:tcPr>
+          <w:p>
+            <w:pPr>
+              <w:jc w:val="left"/>
+            </w:pPr>
+            <w:r>
+              <w:rPr>
+                <w:sz w:val="19"/>
+                <w:szCs w:val="19"/>
+              </w:rPr>
+              <w:t xml:space="preserve"/>
+            </w:r>
+          </w:p>
+        </w:tc>
+      </w:tr>
+      <w:tr>
+        <w:trPr>
+          <w:cantSplit/>
+        </w:trPr>
+        <w:tc>
+          <w:tcPr>
+            <w:tcW w:type="dxa" w:w="520"/>
+            <w:tcBorders>
+              <w:top w:val="single" w:color="A6A6A6" w:sz="4"/>
+              <w:left w:val="single" w:color="A6A6A6" w:sz="4"/>
+              <w:bottom w:val="single" w:color="A6A6A6" w:sz="4"/>
+              <w:right w:val="single" w:color="A6A6A6" w:sz="4"/>
+            </w:tcBorders>
+            <w:tcMar>
+              <w:top w:type="dxa" w:w="60"/>
+              <w:left w:type="dxa" w:w="100"/>
+              <w:bottom w:type="dxa" w:w="60"/>
+              <w:right w:type="dxa" w:w="100"/>
+            </w:tcMar>
+            <w:vAlign w:val="center"/>
+          </w:tcPr>
+          <w:p>
+            <w:pPr>
+              <w:jc w:val="center"/>
+            </w:pPr>
+            <w:r>
+              <w:rPr>
+                <w:sz w:val="22"/>
+                <w:szCs w:val="22"/>
+              </w:rPr>
+              <w:t xml:space="preserve">☐</w:t>
+            </w:r>
+          </w:p>
+        </w:tc>
+        <w:tc>
+          <w:tcPr>
+            <w:tcW w:type="dxa" w:w="4700"/>
+            <w:tcBorders>
+              <w:top w:val="single" w:color="A6A6A6" w:sz="4"/>
+              <w:left w:val="single" w:color="A6A6A6" w:sz="4"/>
+              <w:bottom w:val="single" w:color="A6A6A6" w:sz="4"/>
+              <w:right w:val="single" w:color="A6A6A6" w:sz="4"/>
+            </w:tcBorders>
+            <w:tcMar>
+              <w:top w:type="dxa" w:w="60"/>
+              <w:left w:type="dxa" w:w="100"/>
+              <w:bottom w:type="dxa" w:w="60"/>
+              <w:right w:type="dxa" w:w="100"/>
+            </w:tcMar>
+            <w:vAlign w:val="center"/>
+          </w:tcPr>
+          <w:p>
+            <w:pPr>
+              <w:jc w:val="left"/>
+            </w:pPr>
+            <w:r>
+              <w:rPr>
+                <w:sz w:val="19"/>
+                <w:szCs w:val="19"/>
+              </w:rPr>
               <w:t xml:space="preserve">LALUR/LACS, saldos de prejuízo fiscal e base negativa de CSLL (Lucro Real)</w:t>
             </w:r>
           </w:p>
@@ -7347,7 +8977,6 @@
               <w:bottom w:val="single" w:color="A6A6A6" w:sz="4"/>
               <w:right w:val="single" w:color="A6A6A6" w:sz="4"/>
             </w:tcBorders>
-            <w:shd w:fill="F2F2F2" w:color="auto" w:val="clear"/>
             <w:tcMar>
               <w:top w:type="dxa" w:w="60"/>
               <w:left w:type="dxa" w:w="100"/>
@@ -7378,7 +9007,6 @@
               <w:bottom w:val="single" w:color="A6A6A6" w:sz="4"/>
               <w:right w:val="single" w:color="A6A6A6" w:sz="4"/>
             </w:tcBorders>
-            <w:shd w:fill="F2F2F2" w:color="auto" w:val="clear"/>
             <w:tcMar>
               <w:top w:type="dxa" w:w="60"/>
               <w:left w:type="dxa" w:w="100"/>

</xml_diff>